<commit_message>
Reposition 360PhotoBoothMieten playbook to modular B2B brand activations
Angepasst an die freigegebenen First-Touch-Mails: Angebot als modularer
B2B-Marketing-Partner (Brand Activations, LED-Messesysteme, Eventmodule,
Medienproduktion) mit 360-Booth als Flaggschiff-Modul; ICP/Personas auf
skalierende B2B-/Tech-Unternehmen; signal-getriebene Ansprache. Plus
Messaging-/Trigger-Anhang mit den 4 Mail-Varianten.

Co-Authored-By: Claude Opus 4.8 <noreply@anthropic.com>
Claude-Session: https://claude.ai/code/session_01DfrnnrzmAzBPL7cukfFfoX
</commit_message>
<xml_diff>
--- a/reports/360photoboothmieten/360PhotoBoothMieten Playbook.docx
+++ b/reports/360photoboothmieten/360PhotoBoothMieten Playbook.docx
@@ -7,9 +7,9 @@
         <w:rPr>
           <w:b/>
           <w:color w:val="0A0A0F"/>
-          <w:sz w:val="48"/>
+          <w:sz w:val="44"/>
         </w:rPr>
-        <w:t>Playbook: 360°-Video-Booth für Messen &amp; Brand Activation</w:t>
+        <w:t>Playbook: Modulare B2B Brand Activations für skalierende Unternehmen</w:t>
       </w:r>
     </w:p>
     <w:p>
@@ -18,7 +18,7 @@
           <w:color w:val="6B6B75"/>
           <w:sz w:val="24"/>
         </w:rPr>
-        <w:t>360°PhotoBoothMieten (Threesixtymedia) · Kampagnen-Playbook · Sprache: de · erstellt von amplifa</w:t>
+        <w:t>360° Company / 360°PhotoBoothMieten (Threesixtymedia) · Kampagnen-Playbook · Sprache: de · erstellt von amplifa</w:t>
       </w:r>
     </w:p>
     <w:p>
@@ -28,7 +28,7 @@
           <w:color w:val="6B6B75"/>
           <w:sz w:val="19"/>
         </w:rPr>
-        <w:t>Hinweis: Kein Onboarding-/Kickoff-Call in Fathom auffindbar – Inhalte sind aus Website-Recherche + Market-Intelligence-Report belegt; Unbelegtes ist mit „(zu verifizieren)" markiert und im Kickoff zu bestätigen.</w:t>
+        <w:t>Repositionierung (GTM): Angepasst auf die freigegebenen First-Touch-Mails (Beispiel Parloa/Series D). Angebot wird als modularer B2B-Marketing-Partner geführt (Brand Activations, LED-Messesysteme, interaktive Eventmodule, Medienproduktion) — die 360° Video Booth ist das Flaggschiff-Modul. Zielgruppe: skalierende, oft finanzierte B2B-/Tech-Unternehmen mit Messe-, Partner-Event- und Roadshow-Bedarf. Signal-getriebene Ansprache. Kein Fathom-Onboarding vorhanden; Unbelegtes mit „(zu verifizieren)" markiert.</w:t>
       </w:r>
     </w:p>
     <w:p>
@@ -52,7 +52,7 @@
           <w:i w:val="0"/>
           <w:sz w:val="22"/>
         </w:rPr>
-        <w:t>360°PhotoBoothMieten (Marke „360° Company", rechtlich Threesixtymedia) ist ein inhabergeführter Spezialist für die Vermietung von 360°-Video-Booths mit Sitz in Stolberg (Rheinland/NRW). Anders als klassische Fotobox-Anbieter positioniert sich das Unternehmen bewusst B2B: als Partner für strategische Markenaktivierung und teilbaren, gebrandeten User-Generated-Content auf Messen, Roadshows, Corporate Events und am Point of Sale. Inhaber ist Youssef Ismail; die genaue Mitarbeiterzahl wird auf der Website nicht genannt – gearbeitet wird projektbasiert mit Event-Assistenten vor Ort. Die Website ist zweisprachig (DE/EN) und richtet sich primär an den deutschsprachigen Raum mit Schwerpunkt West-DACH.</w:t>
+        <w:t>Die 360° Company (rechtlich Threesixtymedia, Marke „360°PhotoBoothMieten", Sitz Stolberg/NRW, Inhaber Youssef Ismail) ist ein B2B-Marketing-Partner für modulare Brand Activations. Das Unternehmen unterstützt skalierende Unternehmen dabei, Marke, Produkt und Zielgruppe an physischen Touchpoints erlebbar zu machen — auf Messen, Partner-Events, Roadshows und Enterprise-Events. Das Portfolio umfasst modulare Brand Activations, LED-Messesysteme, interaktive Eventmodule sowie hochwertige Medienproduktion. Die genaue Unternehmensgröße wird auf der Website nicht genannt; gearbeitet wird projektbasiert mit Personal vor Ort, der Auftritt ist zweisprachig (DE/EN) mit Schwerpunkt West-DACH.</w:t>
       </w:r>
     </w:p>
     <w:p>
@@ -62,7 +62,7 @@
           <w:i w:val="0"/>
           <w:sz w:val="22"/>
         </w:rPr>
-        <w:t>Kernleistung ist die schlüsselfertige Vermietung eines 360°-Video-Booths inklusive Plattform für bis zu 5 Personen gleichzeitig, professioneller Kamera mit 120 fps, gebrandeten Videoclips von bis zu 25 Sekunden, sofortigem Download per QR-Code, Live-Gadgets (z. B. Konfetti, Bubbles), Event-Assistent sowie Auf- und Abbau. Der Booth wird im Corporate Design des Kunden gebrandet – von Logo über Farben bis zur Botschaft – sodass jedes Video zu teilbarem Marken-Content wird. Ergänzend bietet das Unternehmen professionelle Event-Foto- und -Videografie als „visuelles Kapital" für PR, Social Media und künftige Kampagnen sowie (zu verifizieren) DSGVO-konforme Lead-/Kontaktdatenerfassung am Booth.</w:t>
+        <w:t>Ein zentrales Modul ist die 360° Video Booth: Sie verbindet Marke und Zielgruppe an einem physischen Touchpoint mit direkt nutzbarem Social Content, hoher Interaktion und optionaler Lead-Erfassung. Technisch fasst die Plattform bis zu 5 Personen gleichzeitig, filmt mit 120 fps und erzeugt gebrandete Clips von bis zu 25 Sekunden, die per QR-Code sofort zum Teilen bereitstehen; Live-Gadgets, Event-Assistent sowie Auf- und Abbau sind Teil des schlüsselfertigen Setups. Der Booth wird vollständig im Corporate Design des Kunden gebrandet und lässt sich als eines von mehreren Aktivierungsmodulen in einen größeren Messe- oder Eventauftritt einbetten.</w:t>
       </w:r>
     </w:p>
     <w:p>
@@ -72,7 +72,7 @@
           <w:i w:val="0"/>
           <w:sz w:val="22"/>
         </w:rPr>
-        <w:t>Im Markt differenziert sich 360°PhotoBoothMieten über die konsequente Ausrichtung auf messbares Live-Marketing statt austauschbaren „Fotospaß". Während der Großteil der DACH-Wettbewerber im preisgetriebenen Consumer-/Hochzeitssegment (449–800 €) konkurriert, verkauft das Unternehmen den Booth als Werkzeug für Standfrequenz, Verweildauer, Social-Reichweite und Leadgenerierung – also für Marketing-Wirkung mit Wow-Effekt. Genau das trifft den steigenden ROI-Druck auf Live-Budgets und den Bedarf an nativem, teilbarem Video-Content.</w:t>
+        <w:t>Im Markt positioniert sich die 360° Company als Partner für messbares Live-Marketing statt austauschbarem „Fotospaß": ein Ansprechpartner, der Markenpräsenz, Social Content, Reichweite und qualifizierte Interaktion an realen Touchpoints zusammenführt. Besonders relevant wird das in Skalierungsphasen — nach Finanzierungsrunden, beim Ausbau des Partner-Ökosystems und bei internationaler Expansion — wenn die Qualität physischer Touchpoints (Messen, Partnerformate, Roadshows) mit dem Wachstum Schritt halten muss.</w:t>
       </w:r>
     </w:p>
     <w:p>
@@ -83,7 +83,7 @@
         <w:t xml:space="preserve">INDUSTRY: </w:t>
       </w:r>
       <w:r>
-        <w:t>Messe- &amp; Eventservice, Live-Marketing, Brand Activation, Experiential Marketing, Eventagenturen, Veranstaltungstechnik</w:t>
+        <w:t>B2B Brand Activation, Live-Marketing, Experiential Marketing, Messe-/Eventservice, LED-Messesysteme, Medienproduktion, Eventmodule</w:t>
       </w:r>
     </w:p>
     <w:p>
@@ -94,7 +94,7 @@
         <w:t xml:space="preserve">USPs: </w:t>
       </w:r>
       <w:r>
-        <w:t>1. 360°-Video-Booth schlüsselfertig inklusive Personal, Auf-/Abbau und Anfahrt – ein Ansprechpartner, kein Organisationsaufwand. 2. Vollständiges Branding im Corporate Design des Kunden für konsistenten Markenauftritt auf jedem Clip. 3. Bis zu 5 Personen gleichzeitig, 120 fps und Clips bis 25 Sekunden für hochwertige, dynamische Aufnahmen. 4. Sofortiger Download per QR-Code – Gäste teilen den gebrandeten Content selbst und sofort auf Social Media. 5. Live-Gadgets (Konfetti, Bubbles u. a.) inklusive für zusätzlichen Wow- und Aufmerksamkeitseffekt. 6. Konsequente B2B-Ausrichtung auf Markenaktivierung und UGC statt reiner Hochzeits-Fotobox. 7. Optionale Event-Foto-/Videografie als zusätzliches visuelles Kapital für PR und Marketing. 8. (zu verifizieren) DSGVO-konforme Datenerfassung am Booth für messbare Leadgenerierung.</w:t>
+        <w:t>1. Modularer B2B-Marketing-Partner: Brand Activations, LED-Messesysteme, interaktive Eventmodule und Medienproduktion aus einer Hand. 2. 360° Video Booth als Flaggschiff-Modul für Social Content, Reichweite und Interaktion am physischen Touchpoint. 3. Schlüsselfertig inklusive Personal, Auf-/Abbau und Anfahrt — ein Ansprechpartner, kein Organisationsaufwand. 4. Vollständiges Branding im Corporate Design für einen konsistenten Markenauftritt auf jedem Touchpoint. 5. Bis zu 5 Personen, 120 fps und Clips bis 25 Sekunden mit sofortigem QR-Sharing. 6. Optionale, (zu verifizieren) DSGVO-konforme Lead-Erfassung direkt an der Aktivierung. 7. Ausrichtung auf skalierende B2B-Unternehmen mit Messe-, Partner-Event- und Roadshow-Bedarf. 8. Kombinierbar zu einem Gesamtauftritt (LED + Booth + Medienproduktion) statt Einzel-Gimmick.</w:t>
       </w:r>
     </w:p>
     <w:p>
@@ -118,7 +118,7 @@
           <w:i w:val="0"/>
           <w:sz w:val="22"/>
         </w:rPr>
-        <w:t>360°PhotoBoothMieten verwandelt Messestände und Events in eine Social-Bühne: mehr Besucherfrequenz und Verweildauer am Stand, teilbarer gebrandeter Video-Content und – richtig aufgesetzt – qualifizierte Leads. Statt eines austauschbaren Gimmicks erhalten Marken und Aussteller ein schlüsselfertiges Live-Marketing-Werkzeug inklusive Personal, das messbare Aufmerksamkeit und Reichweite erzeugt, ohne dass das eigene Team Aufwand oder Risiko trägt.</w:t>
+        <w:t>Die 360° Company hilft skalierenden B2B-Unternehmen, ihre Marke an physischen Touchpoints — Messen, Partner-Events und Roadshows — auf Enterprise-Niveau erlebbar zu machen und daraus direkt Social Content, Reichweite und qualifizierte Interaktion zu erzeugen. Über modulare Brand Activations, LED-Messesysteme, interaktive Eventmodule und Medienproduktion aus einer Hand — mit der 360° Video Booth als kompaktem Aktivierungsmodul und optionaler Lead-Erfassung — entsteht messbare Markenwirkung, ohne dass das eigene Team Aufwand oder Umsetzungsrisiko trägt.</w:t>
       </w:r>
     </w:p>
     <w:p>
@@ -144,7 +144,7 @@
           <w:b/>
           <w:sz w:val="26"/>
         </w:rPr>
-        <w:t>Eventmanagerin Lena</w:t>
+        <w:t>Head of Marketing Sarah (Scale-up)</w:t>
       </w:r>
     </w:p>
     <w:p>
@@ -155,7 +155,7 @@
           <w:color w:val="6B6B75"/>
           <w:sz w:val="22"/>
         </w:rPr>
-        <w:t>Eventmanager, Messeverantwortlicher, Trade-Fair Manager, Live-Communication Manager, Projektleiter Events</w:t>
+        <w:t>Head of Marketing, VP Marketing, CMO, Marketingleitung (skalierendes B2B-/Tech-Unternehmen)</w:t>
       </w:r>
     </w:p>
     <w:p>
@@ -172,7 +172,7 @@
         <w:spacing w:after="40"/>
       </w:pPr>
       <w:r>
-        <w:t>Sie muss dafür sorgen, dass der Messestand aus der Masse heraussticht und Besucher anzieht – die Standfläche ist teuer und darf nicht leer wirken.</w:t>
+        <w:t>Sie muss die Markenpräsenz mit dem Unternehmenswachstum skalieren — nach Funding und bei internationaler Expansion steigen die Erwartungen an jeden Auftritt.</w:t>
       </w:r>
     </w:p>
     <w:p>
@@ -181,7 +181,7 @@
         <w:spacing w:after="40"/>
       </w:pPr>
       <w:r>
-        <w:t>Sie steht unter Druck, die Verweildauer am Stand und die Zahl der Standkontakte messbar zu erhöhen.</w:t>
+        <w:t>Sie will, dass physische Touchpoints (Messen, Roadshows) das gleiche Premium-Niveau haben wie die digitale Marke.</w:t>
       </w:r>
     </w:p>
     <w:p>
@@ -190,7 +190,7 @@
         <w:spacing w:after="40"/>
       </w:pPr>
       <w:r>
-        <w:t>Sie braucht eine Attraktion, die reibungslos läuft, ohne dass sie sich am Eventtag noch um Technik und Auf-/Abbau kümmern muss.</w:t>
+        <w:t>Sie steht unter Druck, Marketing-Budget mit messbarer Wirkung — Reichweite, Interaktion, Leads — zu rechtfertigen.</w:t>
       </w:r>
     </w:p>
     <w:p>
@@ -199,7 +199,7 @@
         <w:spacing w:after="40"/>
       </w:pPr>
       <w:r>
-        <w:t>Sie will dem Management nach der Messe belegbare Ergebnisse zeigen, nicht nur „war ein schöner Stand".</w:t>
+        <w:t>Sie braucht Partner, die schlüsselfertig liefern, damit ihr schlankes Team sich nicht in Eventlogistik verliert.</w:t>
       </w:r>
     </w:p>
     <w:p>
@@ -208,7 +208,7 @@
         <w:spacing w:after="40"/>
       </w:pPr>
       <w:r>
-        <w:t>Sie sucht nach etwas Neuem jenseits der klassischen Fotobox, die viele Stände schon hatten.</w:t>
+        <w:t>Sie sucht Aktivierungen, die direkt teilbaren Social Content erzeugen und die Marke über das Event hinaus tragen.</w:t>
       </w:r>
     </w:p>
     <w:p>
@@ -220,7 +220,7 @@
           <w:b/>
           <w:sz w:val="26"/>
         </w:rPr>
-        <w:t>Brand-Manager Daniel</w:t>
+        <w:t>Head of Partnerships David</w:t>
       </w:r>
     </w:p>
     <w:p>
@@ -231,7 +231,7 @@
           <w:color w:val="6B6B75"/>
           <w:sz w:val="22"/>
         </w:rPr>
-        <w:t>Marketing Manager, Brand Manager, Brand-Activation Manager, Head of Marketing, Marketingleiter</w:t>
+        <w:t>Head of Partnerships, Partner Marketing Manager, Head of Alliances, Ecosystem Lead</w:t>
       </w:r>
     </w:p>
     <w:p>
@@ -248,7 +248,7 @@
         <w:spacing w:after="40"/>
       </w:pPr>
       <w:r>
-        <w:t>Er muss sein Live-/Eventbudget gegenüber der Geschäftsführung mit messbarer Wirkung (Reichweite, Leads) rechtfertigen.</w:t>
+        <w:t>Er baut ein wachsendes Partner-Ökosystem auf und muss Partner-Events und Co-Marketing-Formate hochwertig inszenieren.</w:t>
       </w:r>
     </w:p>
     <w:p>
@@ -257,7 +257,7 @@
         <w:spacing w:after="40"/>
       </w:pPr>
       <w:r>
-        <w:t>Er braucht laufend frischen, teilbaren Video-Content für Social Media, ohne jedes Mal eine teure Produktion aufzusetzen.</w:t>
+        <w:t>Er will, dass gemeinsame Auftritte mit Partnern Aufmerksamkeit erzeugen und die Marke bei deren Zielgruppen sichtbar machen.</w:t>
       </w:r>
     </w:p>
     <w:p>
@@ -266,7 +266,7 @@
         <w:spacing w:after="40"/>
       </w:pPr>
       <w:r>
-        <w:t>Er will, dass jede Aktivierung konsequent im Corporate Design auftritt und die Markenbotschaft transportiert.</w:t>
+        <w:t>Er braucht Module, die sich flexibel in Partnerformate, Messen und Roadshows einbetten lassen.</w:t>
       </w:r>
     </w:p>
     <w:p>
@@ -275,7 +275,7 @@
         <w:spacing w:after="40"/>
       </w:pPr>
       <w:r>
-        <w:t>Er sucht Aktivierungsformate, die Aufmerksamkeit erzeugen und gleichzeitig Daten/Leads für den Vertrieb liefern.</w:t>
+        <w:t>Er muss aus Partner-Events verwertbare Kontakte und Content mitnehmen, nicht nur Händeschütteln.</w:t>
       </w:r>
     </w:p>
     <w:p>
@@ -284,7 +284,7 @@
         <w:spacing w:after="40"/>
       </w:pPr>
       <w:r>
-        <w:t>Er steht unter Druck, mit begrenztem Budget mehr Marken-Wirkung pro Event herauszuholen.</w:t>
+        <w:t>Er hat selten eigene Eventressourcen und braucht einen verlässlichen Umsetzungspartner.</w:t>
       </w:r>
     </w:p>
     <w:p>
@@ -296,7 +296,7 @@
           <w:b/>
           <w:sz w:val="26"/>
         </w:rPr>
-        <w:t>Agentur-Producer Mark</w:t>
+        <w:t>Field- &amp; Event-Marketing-Manager Nina</w:t>
       </w:r>
     </w:p>
     <w:p>
@@ -307,7 +307,7 @@
           <w:color w:val="6B6B75"/>
           <w:sz w:val="22"/>
         </w:rPr>
-        <w:t>Projektleiter Live-Kommunikation, Producer, Account Director Eventagentur, Senior Projektmanager Brand Experience</w:t>
+        <w:t>Field Marketing Manager, Event Marketing Manager, Head of Events, Trade-Fair Manager</w:t>
       </w:r>
     </w:p>
     <w:p>
@@ -324,7 +324,7 @@
         <w:spacing w:after="40"/>
       </w:pPr>
       <w:r>
-        <w:t>Er muss für seine Markenkunden verlässliche Subdienstleister finden, die Qualität und Timing zu 100 % halten.</w:t>
+        <w:t>Sie verantwortet mehrere Messen, Roadshow-Stopps und Enterprise-Events pro Jahr und muss jeden Auftritt zum Highlight machen.</w:t>
       </w:r>
     </w:p>
     <w:p>
@@ -333,7 +333,7 @@
         <w:spacing w:after="40"/>
       </w:pPr>
       <w:r>
-        <w:t>Er trägt das Risiko, wenn ein Modul am Eventtag nicht funktioniert – ein Ausfall fällt direkt auf die Agentur zurück.</w:t>
+        <w:t>Sie steht unter Druck, Standfrequenz, Verweildauer und qualifizierte Gespräche messbar zu steigern.</w:t>
       </w:r>
     </w:p>
     <w:p>
@@ -342,7 +342,7 @@
         <w:spacing w:after="40"/>
       </w:pPr>
       <w:r>
-        <w:t>Er braucht Partner, die white-label-fähig sind und sich nahtlos ins CI seiner Kunden einfügen.</w:t>
+        <w:t>Sie will ein Modul, das reibungslos funktioniert und inklusive Personal, Auf- und Abbau kommt.</w:t>
       </w:r>
     </w:p>
     <w:p>
@@ -351,7 +351,7 @@
         <w:spacing w:after="40"/>
       </w:pPr>
       <w:r>
-        <w:t>Er will Module, die er kalkulierbar wiederverwenden und über mehrere Kundenprojekte hinweg einsetzen kann.</w:t>
+        <w:t>Sie braucht reproduzierbare Setups, die über mehrere Termine hinweg identisch hochwertig sind.</w:t>
       </w:r>
     </w:p>
     <w:p>
@@ -360,7 +360,7 @@
         <w:spacing w:after="40"/>
       </w:pPr>
       <w:r>
-        <w:t>Er muss bei Pitches mit innovativen, social-tauglichen Formaten überzeugen, ohne alles selbst aufzubauen.</w:t>
+        <w:t>Sie sucht ein frisches Format jenseits der Standard-Fotobox, das social-tauglichen Content erzeugt.</w:t>
       </w:r>
     </w:p>
     <w:p>
@@ -372,7 +372,7 @@
           <w:b/>
           <w:sz w:val="26"/>
         </w:rPr>
-        <w:t>Social-Media-Managerin Jana</w:t>
+        <w:t>Head of Brand Alex</w:t>
       </w:r>
     </w:p>
     <w:p>
@@ -383,7 +383,7 @@
           <w:color w:val="6B6B75"/>
           <w:sz w:val="22"/>
         </w:rPr>
-        <w:t>Social Media Manager, Content Manager, Online-Marketing Manager, Content Creator</w:t>
+        <w:t>Head of Brand, Brand Manager, Brand Activation Manager, Head of Brand Experience</w:t>
       </w:r>
     </w:p>
     <w:p>
@@ -400,7 +400,7 @@
         <w:spacing w:after="40"/>
       </w:pPr>
       <w:r>
-        <w:t>Sie braucht eine konstante Pipeline an authentischem, vertikalem Video-Content für Instagram, TikTok &amp; Co.</w:t>
+        <w:t>Er muss sicherstellen, dass die Marke an jedem physischen Touchpoint konsistent und premium auftritt.</w:t>
       </w:r>
     </w:p>
     <w:p>
@@ -409,7 +409,7 @@
         <w:spacing w:after="40"/>
       </w:pPr>
       <w:r>
-        <w:t>Sie will, dass Besucher selbst Content erstellen und teilen, statt alles selbst produzieren zu müssen.</w:t>
+        <w:t>Er will Aktivierungen, die die Markenbotschaft erlebbar machen, nicht nur dekorieren.</w:t>
       </w:r>
     </w:p>
     <w:p>
@@ -418,7 +418,7 @@
         <w:spacing w:after="40"/>
       </w:pPr>
       <w:r>
-        <w:t>Sie steht unter Druck, Reichweite und Engagement rund um Events nachzuweisen.</w:t>
+        <w:t>Er braucht hochwertigen, gebrandeten Content aus jedem Event für Always-on-Kanäle.</w:t>
       </w:r>
     </w:p>
     <w:p>
@@ -427,7 +427,7 @@
         <w:spacing w:after="40"/>
       </w:pPr>
       <w:r>
-        <w:t>Sie benötigt Material, das sofort verfügbar ist – nicht erst Wochen nach dem Event nach langer Postproduktion.</w:t>
+        <w:t>Er sucht ein modulares Aktivierungskonzept, das mit der Marke mitwächst.</w:t>
       </w:r>
     </w:p>
     <w:p>
@@ -439,7 +439,7 @@
           <w:b/>
           <w:sz w:val="26"/>
         </w:rPr>
-        <w:t>Geschäftsführer Stefan (KMU-Aussteller)</w:t>
+        <w:t>Demand-Gen-Lead Tom</w:t>
       </w:r>
     </w:p>
     <w:p>
@@ -450,7 +450,7 @@
           <w:color w:val="6B6B75"/>
           <w:sz w:val="22"/>
         </w:rPr>
-        <w:t>Geschäftsführer, Inhaber, Vertriebsleiter (kleinerer Aussteller), Geschäftsführender Gesellschafter</w:t>
+        <w:t>Demand Generation Manager, Growth Marketing Lead, Head of Growth, Pipeline Marketing Manager</w:t>
       </w:r>
     </w:p>
     <w:p>
@@ -467,7 +467,7 @@
         <w:spacing w:after="40"/>
       </w:pPr>
       <w:r>
-        <w:t>Er muss mit begrenztem Messebudget einen Auftritt hinbekommen, der gegen größere Wettbewerber besteht.</w:t>
+        <w:t>Er muss aus teuren Event-Investitionen belegbare Pipeline und Leads ziehen.</w:t>
       </w:r>
     </w:p>
     <w:p>
@@ -476,7 +476,7 @@
         <w:spacing w:after="40"/>
       </w:pPr>
       <w:r>
-        <w:t>Er will einen klaren Kosten-Nutzen-Effekt und einen Ansprechpartner, der alles übernimmt.</w:t>
+        <w:t>Er will physische Touchpoints in messbare, DSGVO-konforme Kontakte übersetzen.</w:t>
       </w:r>
     </w:p>
     <w:p>
@@ -485,7 +485,7 @@
         <w:spacing w:after="40"/>
       </w:pPr>
       <w:r>
-        <w:t>Er braucht eine Außenwirkung, die seinen Stand modern und attraktiv erscheinen lässt.</w:t>
+        <w:t>Er braucht Formate, die hohe Interaktion erzeugen und gleichzeitig Daten liefern.</w:t>
       </w:r>
     </w:p>
     <w:p>
@@ -494,7 +494,7 @@
         <w:spacing w:after="40"/>
       </w:pPr>
       <w:r>
-        <w:t>Er hat keine Marketingabteilung, die sich um zusätzliche Technik und Logistik kümmern kann.</w:t>
+        <w:t>Er steht unter Druck, den ROI jeder Aktivierung an Reichweite und Interaktion festzumachen.</w:t>
       </w:r>
     </w:p>
     <w:p>
@@ -520,7 +520,7 @@
           <w:b/>
           <w:sz w:val="24"/>
         </w:rPr>
-        <w:t>Standmagnet auf der Leitmesse</w:t>
+        <w:t>Markenpräsenz in der Skalierungsphase auf Enterprise-Niveau heben</w:t>
       </w:r>
     </w:p>
     <w:p>
@@ -530,7 +530,7 @@
           <w:i w:val="0"/>
           <w:sz w:val="22"/>
         </w:rPr>
-        <w:t>Aussteller zahlen viel für Standfläche, kämpfen aber darum, Besucher anzuziehen und länger zu halten. 360°PhotoBoothMieten stellt einen im CI gebrandeten 360°-Video-Booth schlüsselfertig auf den Stand – inklusive Personal, Auf- und Abbau. Das Ergebnis ist spürbar höhere Standfrequenz, längere Verweildauer und Gesprächsanlässe, weil Besucher anstehen, um ihren eigenen gebrandeten Clip aufzunehmen und sofort zu teilen.</w:t>
+        <w:t>Nach einer Finanzierungsrunde oder bei internationaler Expansion steigen die Erwartungen an jeden physischen Auftritt, während das Marketingteam oft schlank bleibt. Die 360° Company liefert modulare Brand Activations inklusive LED-Messesystemen, Eventmodulen und Medienproduktion aus einer Hand. So halten Messen, Partnerformate und Roadshows qualitativ mit dem Wachstum Schritt, ohne dass intern Kapazität aufgebaut werden muss.</w:t>
       </w:r>
     </w:p>
     <w:p>
@@ -542,7 +542,7 @@
           <w:b/>
           <w:sz w:val="24"/>
         </w:rPr>
-        <w:t>DSGVO-konforme Leadgenerierung am Messestand</w:t>
+        <w:t>Partner-Event- und Co-Marketing-Aktivierung</w:t>
       </w:r>
     </w:p>
     <w:p>
@@ -552,7 +552,7 @@
           <w:i w:val="0"/>
           <w:sz w:val="22"/>
         </w:rPr>
-        <w:t>Marketing- und Vertriebsverantwortliche brauchen aus teuren Messeauftritten verwertbare Leads, nicht nur Sichtkontakte. Der Booth lässt sich (zu verifizieren) mit einer Opt-in-Datenerfassung kombinieren, sodass Besucher ihren Clip gegen Hinterlassen ihrer Kontaktdaten erhalten. So entsteht aus der Attraktion eine messbare, DSGVO-konforme Liste interessierter Kontakte, die das Live-Budget belegbar rechtfertigt.</w:t>
+        <w:t>Beim Ausbau des Partner-Ökosystems müssen gemeinsame Auftritte Aufmerksamkeit erzeugen und die Marke bei den Zielgruppen der Partner sichtbar machen. Die 360° Video Booth und weitere Module lassen sich flexibel in Partner-Events einbetten und erzeugen teilbaren, gebrandeten Content sowie qualifizierte Interaktion. Das Ergebnis ist ein Partnerformat, das Reichweite und Kontakte über den Event-Tag hinaus liefert.</w:t>
       </w:r>
     </w:p>
     <w:p>
@@ -564,7 +564,7 @@
           <w:b/>
           <w:sz w:val="24"/>
         </w:rPr>
-        <w:t>Roadshow &amp; Produktlaunch mit reproduzierbarem Marken-Content</w:t>
+        <w:t>Enterprise-tauglicher Messeauftritt aus einem Guss</w:t>
       </w:r>
     </w:p>
     <w:p>
@@ -574,7 +574,7 @@
           <w:i w:val="0"/>
           <w:sz w:val="22"/>
         </w:rPr>
-        <w:t>Bei Roadshows und Launches muss dieselbe Markeninszenierung über mehrere Termine hinweg verlässlich funktionieren. 360°PhotoBoothMieten liefert ein standardisiertes, gebrandetes Booth-Setup, das an jedem Stopp identisch hochwertige 360°-Clips produziert. Das Ergebnis ist ein konsistenter Markenauftritt und ein wiederverwendbarer Strom an teilbarem Content über die gesamte Tour.</w:t>
+        <w:t>Aussteller wollen einen Stand, der aus der Masse heraussticht und zum Premium-Markenbild passt. Die 360° Company kombiniert LED-Messesysteme, interaktive Eventmodule und die 360° Video Booth zu einem stimmigen Gesamtauftritt inklusive Personal. Das steigert Standfrequenz und Verweildauer und liefert gleichzeitig gebrandeten Social Content vom Messeauftritt.</w:t>
       </w:r>
     </w:p>
     <w:p>
@@ -586,7 +586,7 @@
           <w:b/>
           <w:sz w:val="24"/>
         </w:rPr>
-        <w:t>White-Label-Modul für Eventagenturen</w:t>
+        <w:t>Reproduzierbare Roadshow über mehrere Standorte</w:t>
       </w:r>
     </w:p>
     <w:p>
@@ -596,7 +596,7 @@
           <w:i w:val="0"/>
           <w:sz w:val="22"/>
         </w:rPr>
-        <w:t>Eventagenturen brauchen verlässliche, CI-treue Module für ihre Markenkunden, ohne eigene Technik vorzuhalten. 360°PhotoBoothMieten agiert als white-label-fähiger Subdienstleister mit termintreuer Umsetzung und Personal vor Ort. Die Agentur kann das 360°-Modul kalkulierbar in Pitches und Projekten einsetzen und trägt deutlich weniger Umsetzungsrisiko.</w:t>
+        <w:t>Bei internationalen Roadshows muss dieselbe Markeninszenierung an jedem Stopp verlässlich funktionieren. Die 360° Company stellt ein standardisiertes, gebrandetes Modul-Setup bereit, das an jedem Termin identisch hochwertige Aktivierung und Content produziert. Das Ergebnis ist ein konsistenter Markenauftritt und ein durchgängiger Content-Strom über die gesamte Tour.</w:t>
       </w:r>
     </w:p>
     <w:p>
@@ -608,7 +608,7 @@
           <w:b/>
           <w:sz w:val="24"/>
         </w:rPr>
-        <w:t>Pop-up- und Point-of-Sale-Aktivierung im Retail</w:t>
+        <w:t>Produkt- oder Milestone-Launch in Social Content übersetzen</w:t>
       </w:r>
     </w:p>
     <w:p>
@@ -618,7 +618,7 @@
           <w:i w:val="0"/>
           <w:sz w:val="22"/>
         </w:rPr>
-        <w:t>Handels- und Konsumgütermarken wollen an Pop-up-Flächen und am PoS Aufmerksamkeit erzeugen und Laufkundschaft in Markenkontakte verwandeln. Der 360°-Video-Booth wird im Markendesign aufgebaut und lädt Passanten ein, sich filmen zu lassen und den gebrandeten Clip sofort zu teilen. Das Ergebnis ist erhöhte Standzeit am PoS, organische Social-Reichweite und ein modernes, erlebbares Markenbild direkt am Verkaufsort.</w:t>
+        <w:t>Ein Produktlaunch oder ein Unternehmens-Meilenstein (z. B. Funding, neue Partnerschaft) braucht sichtbare, teilbare Momente. Die 360° Company inszeniert den Anlass mit Aktivierungsmodul und hochwertiger Medienproduktion, sodass daraus direkt nutzbarer Social Content und Reichweite entstehen. Das Ergebnis ist ein Launch, der über die Anwesenden hinaus wirkt.</w:t>
       </w:r>
     </w:p>
     <w:p>
@@ -630,7 +630,7 @@
           <w:b/>
           <w:sz w:val="24"/>
         </w:rPr>
-        <w:t>Corporate Event mit Social-Reichweite und Wow-Effekt</w:t>
+        <w:t>Qualifizierte Lead-Erfassung am physischen Touchpoint</w:t>
       </w:r>
     </w:p>
     <w:p>
@@ -640,7 +640,7 @@
           <w:i w:val="0"/>
           <w:sz w:val="22"/>
         </w:rPr>
-        <w:t>Bei Firmenfeiern, Mitarbeiter- und Kundenevents soll ein bleibender Eindruck entstehen und gleichzeitig teilbarer Content für die Außenwirkung produziert werden. 360°PhotoBoothMieten bringt den Booth schlüsselfertig inklusive Event-Assistent und Live-Gadgets mit. Gäste werden zu Akteuren ihrer eigenen gebrandeten Clips, was Stimmung erzeugt und dem Unternehmen sofort verfügbares Video-Material für Social Media und Employer Branding liefert.</w:t>
+        <w:t>Demand-Gen- und Vertriebsverantwortliche brauchen aus Event-Investitionen verwertbare Kontakte statt reiner Sichtkontakte. Die 360° Video Booth lässt sich (zu verifizieren) mit einer Opt-in-Datenerfassung kombinieren, sodass Besucher ihren gebrandeten Clip gegen ihre Kontaktdaten erhalten. So wird aus hoher Interaktion eine messbare, DSGVO-konforme Kontaktliste.</w:t>
       </w:r>
     </w:p>
     <w:p>
@@ -665,7 +665,7 @@
           <w:color w:val="6B6B75"/>
           <w:sz w:val="22"/>
         </w:rPr>
-        <w:t>(zu verifizieren – aus Onboarding ergänzen) Auf der Website und in öffentlich recherchierbaren Quellen ließen sich keine belegten, namentlich nennbaren Referenzkunden mit Kundenstimme identifizieren. Im Kickoff 2–3 nennbare Referenzprojekte mit Marke, Eventtyp, Ansprechpartner und – idealerweise – Kennzahlen (z. B. Anzahl erstellter Clips, Reichweite, generierte Leads) sowie Logo-/Case-Freigabe einsammeln. Bis dahin Block leer lassen, nicht erfinden.</w:t>
+        <w:t>(zu verifizieren – aus Onboarding ergänzen) Es ließen sich keine belegten, namentlich nennbaren Referenzkunden mit Kundenstimme identifizieren. Im Kickoff 2–3 nennbare Referenzprojekte mit Marke, Format (Messe/Partner-Event/Roadshow), Ansprechpartner und – idealerweise – Kennzahlen (erstellte Clips, Reichweite, generierte Leads) sowie Logo-/Case-Freigabe einsammeln. Besonders wertvoll wären Referenzen aus dem skalierenden B2B-/Tech-Segment. Bis dahin Block leer lassen, nicht erfinden.</w:t>
       </w:r>
     </w:p>
     <w:p>
@@ -691,7 +691,7 @@
           <w:b/>
           <w:sz w:val="24"/>
         </w:rPr>
-        <w:t>Bis zu 5 Personen, 120 fps und Clips bis 25 Sekunden</w:t>
+        <w:t>Modulares Portfolio aus einer Hand</w:t>
       </w:r>
     </w:p>
     <w:p>
@@ -701,7 +701,7 @@
           <w:i w:val="0"/>
           <w:sz w:val="22"/>
         </w:rPr>
-        <w:t>Die technische Ausstattung ist auf der Website ausgewiesen: Die Plattform fasst bis zu fünf Personen gleichzeitig, die Kamera nimmt mit 120 fps auf und erzeugt Videos von bis zu 25 Sekunden Länge – Grundlage für hochwertige, dynamische 360°-Clips statt einfacher Schnappschüsse.</w:t>
+        <w:t>Die 360° Company führt Brand Activations, LED-Messesysteme, interaktive Eventmodule und Medienproduktion zusammen. Kunden erhalten einen Ansprechpartner für einen stimmigen Gesamtauftritt statt vieler Einzeldienstleister — ein zentrales Argument für skalierende Teams mit begrenzter interner Kapazität.</w:t>
       </w:r>
     </w:p>
     <w:p>
@@ -713,7 +713,7 @@
           <w:b/>
           <w:sz w:val="24"/>
         </w:rPr>
-        <w:t>Vollständiges Branding im Corporate Design des Kunden</w:t>
+        <w:t>360° Video Booth: bis zu 5 Personen, 120 fps, Clips bis 25 Sekunden</w:t>
       </w:r>
     </w:p>
     <w:p>
@@ -723,7 +723,29 @@
           <w:i w:val="0"/>
           <w:sz w:val="22"/>
         </w:rPr>
-        <w:t>Laut Eigenbeschreibung wird der 360°-Video-Booth individuell auf das Corporate Design abgestimmt – von Logo über Farben bis zur Botschaft. Jeder erzeugte Clip transportiert damit konsistent die Marke des Kunden auf Events, Messen und in Social Media.</w:t>
+        <w:t>Das Flaggschiff-Modul ist technisch klar spezifiziert: Plattform für bis zu fünf Personen gleichzeitig, Aufnahme mit 120 fps und gebrandete Clips von bis zu 25 Sekunden — Grundlage für hochwertigen, teilbaren Content statt einfacher Schnappschüsse.</w:t>
+      </w:r>
+    </w:p>
+    <w:p>
+      <w:pPr>
+        <w:spacing w:before="160" w:after="40"/>
+      </w:pPr>
+      <w:r>
+        <w:rPr>
+          <w:b/>
+          <w:sz w:val="24"/>
+        </w:rPr>
+        <w:t>Vollständiges Branding im Corporate Design</w:t>
+      </w:r>
+    </w:p>
+    <w:p>
+      <w:r>
+        <w:rPr>
+          <w:b w:val="0"/>
+          <w:i w:val="0"/>
+          <w:sz w:val="22"/>
+        </w:rPr>
+        <w:t>Jedes Modul wird auf das Corporate Design des Kunden abgestimmt — von Logo über Farben bis zur Botschaft. So transportiert jeder Touchpoint konsistent die Marke, auf dem Event wie in Social Media.</w:t>
       </w:r>
     </w:p>
     <w:p>
@@ -745,7 +767,7 @@
           <w:i w:val="0"/>
           <w:sz w:val="22"/>
         </w:rPr>
-        <w:t>Das Angebot umfasst einen persönlichen Event-Assistenten vor Ort sowie Auf- und Abbau; die Anfahrt wird deutschlandweit beworben. Der Kunde muss sich am Eventtag um nichts kümmern – ein zentrales Argument für reibungslose Messe- und Eventeinsätze.</w:t>
+        <w:t>Das Angebot umfasst Personal vor Ort sowie Auf- und Abbau; die Anfahrt wird deutschlandweit beworben. Das entlastet schlanke Marketing- und Eventteams und sichert einen reibungslosen Ablauf am Eventtag.</w:t>
       </w:r>
     </w:p>
     <w:p>
@@ -757,7 +779,7 @@
           <w:b/>
           <w:sz w:val="24"/>
         </w:rPr>
-        <w:t>Sofortiges Teilen per QR-Code für organische Reichweite</w:t>
+        <w:t>Sofortiges Teilen und optionale Lead-Erfassung</w:t>
       </w:r>
     </w:p>
     <w:p>
@@ -767,7 +789,7 @@
           <w:i w:val="0"/>
           <w:sz w:val="22"/>
         </w:rPr>
-        <w:t>Aufnahmen stehen unmittelbar per QR-Code zum Download bereit, sodass Gäste ihren gebrandeten Clip direkt auf Instagram, TikTok &amp; Co. teilen. Aus jeder Aufnahme wird so potenziell organische, markengetriebene Social-Reichweite.</w:t>
+        <w:t>Aufnahmen stehen per QR-Code sofort zum Teilen bereit und erzeugen organische, markengetriebene Reichweite; optional lässt sich (zu verifizieren) eine DSGVO-konforme Lead-Erfassung ergänzen, die Interaktion in messbare Kontakte übersetzt.</w:t>
       </w:r>
     </w:p>
     <w:p>
@@ -779,7 +801,7 @@
           <w:b/>
           <w:sz w:val="24"/>
         </w:rPr>
-        <w:t>Konsequente B2B-Positionierung als Brand-Activation-Tool</w:t>
+        <w:t>Marktrückenwind für physische B2B-Aktivierungen</w:t>
       </w:r>
     </w:p>
     <w:p>
@@ -789,7 +811,37 @@
           <w:i w:val="0"/>
           <w:sz w:val="22"/>
         </w:rPr>
-        <w:t>360°PhotoBoothMieten beschreibt sich selbst als Anbieter strategischer Markenaktivierung und branded User-Generated-Content für Messen, Roadshows, Corporate Events und Point of Sale – und grenzt sich damit klar vom austauschbaren Consumer-/Hochzeits-Fotoboxmarkt ab.</w:t>
+        <w:t>Der Bedarf ist strukturell belegt: Experiential Marketing macht rund 28–35 % der Marketingbudgets aus, 97 % der B2B-Marketer halten Vor-Ort-Events für maßgeblich, und die deutsche Messewirtschaft zählte 2025 rund 190.000 Aussteller auf 304 Messen (AUMA). Gerade in Skalierungsphasen gewinnen hochwertige physische Touchpoints an Bedeutung.</w:t>
+      </w:r>
+    </w:p>
+    <w:p>
+      <w:r>
+        <w:br w:type="page"/>
+      </w:r>
+    </w:p>
+    <w:p>
+      <w:pPr>
+        <w:spacing w:before="280"/>
+        <w:shd w:val="clear" w:color="auto" w:fill="2A6FFD"/>
+      </w:pPr>
+      <w:r>
+        <w:rPr>
+          <w:b/>
+          <w:color w:val="FFFFFF"/>
+          <w:sz w:val="26"/>
+        </w:rPr>
+        <w:t xml:space="preserve">  Anhang (nicht für App-Felder) — Messaging-Framework &amp; Trigger  </w:t>
+      </w:r>
+    </w:p>
+    <w:p>
+      <w:r>
+        <w:rPr>
+          <w:b w:val="0"/>
+          <w:i/>
+          <w:color w:val="6B6B75"/>
+          <w:sz w:val="22"/>
+        </w:rPr>
+        <w:t>Dieser Anhang übersetzt die Positionierung in die konkrete Erstansprache. Grundlage sind die vier freigegebenen First-Touch-Varianten (Beispiel Parloa). Er dient dem Kampagnen-Setup und gehört nicht in die App-Playbook-Felder.</w:t>
       </w:r>
     </w:p>
     <w:p>
@@ -801,7 +853,7 @@
           <w:b/>
           <w:sz w:val="24"/>
         </w:rPr>
-        <w:t>Marktrückenwind für Live-Marketing und UGC</w:t>
+        <w:t>Messaging-Prinzip: Signal → Angebot → Modul → Soft-CTA</w:t>
       </w:r>
     </w:p>
     <w:p>
@@ -811,7 +863,260 @@
           <w:i w:val="0"/>
           <w:sz w:val="22"/>
         </w:rPr>
-        <w:t>Der Bedarf ist strukturell belegt: Experiential Marketing macht rund 28–35 % der Marketingbudgets aus, 97 % der B2B-Marketer halten Vor-Ort-Events für maßgeblich, und die deutsche Messewirtschaft zählte 2025 rund 190.000 Aussteller auf 304 Messen (AUMA). Ein 360°-Booth bedient genau die Nachfrage nach aufmerksamkeitsstarken, social-tauglichen Aktivierungen.</w:t>
+        <w:t>Jede Mail öffnet mit einem firmenspezifischen Trigger (z. B. Funding, Partner-Ökosystem, internationale Skalierung), positioniert die 360° Company als modularen B2B-Marketing-Partner, nennt die 360° Video Booth als konkretes Beispiel-Modul und schließt mit einem niederschwelligen CTA (kurzer digitaler Austausch / 30 Minuten). Ton: strategisch, seriös, premium, knapp.</w:t>
+      </w:r>
+    </w:p>
+    <w:p>
+      <w:r>
+        <w:rPr>
+          <w:b/>
+        </w:rPr>
+        <w:t>Trigger / Buying-Signals für die Personalisierung des Openers:</w:t>
+      </w:r>
+    </w:p>
+    <w:p>
+      <w:pPr>
+        <w:pStyle w:val="ListBullet"/>
+        <w:spacing w:after="40"/>
+      </w:pPr>
+      <w:r>
+        <w:t>Finanzierungsrunde / Series X / frisches Kapital (Skalierungssignal)</w:t>
+      </w:r>
+    </w:p>
+    <w:p>
+      <w:pPr>
+        <w:pStyle w:val="ListBullet"/>
+        <w:spacing w:after="40"/>
+      </w:pPr>
+      <w:r>
+        <w:t>Ausbau des Partner-Ökosystems, neue Allianzen oder Partnerprogramme</w:t>
+      </w:r>
+    </w:p>
+    <w:p>
+      <w:pPr>
+        <w:pStyle w:val="ListBullet"/>
+        <w:spacing w:after="40"/>
+      </w:pPr>
+      <w:r>
+        <w:t>Internationale Expansion / neue Märkte / neue Standorte</w:t>
+      </w:r>
+    </w:p>
+    <w:p>
+      <w:pPr>
+        <w:pStyle w:val="ListBullet"/>
+        <w:spacing w:after="40"/>
+      </w:pPr>
+      <w:r>
+        <w:t>Angekündigte Messeteilnahme, Roadshow oder Partner-/Enterprise-Event (mit Datum = stärkster Trigger)</w:t>
+      </w:r>
+    </w:p>
+    <w:p>
+      <w:pPr>
+        <w:pStyle w:val="ListBullet"/>
+        <w:spacing w:after="40"/>
+      </w:pPr>
+      <w:r>
+        <w:t>Produktlaunch, Rebranding oder Unternehmens-Meilenstein</w:t>
+      </w:r>
+    </w:p>
+    <w:p>
+      <w:pPr>
+        <w:pStyle w:val="ListBullet"/>
+        <w:spacing w:after="40"/>
+      </w:pPr>
+      <w:r>
+        <w:t>Hiring in Field-/Event-/Partner-Marketing oder Brand</w:t>
+      </w:r>
+    </w:p>
+    <w:p>
+      <w:r>
+        <w:rPr>
+          <w:b/>
+        </w:rPr>
+        <w:t>Zielpersonen (Empfänger der Erstansprache):</w:t>
+      </w:r>
+    </w:p>
+    <w:p>
+      <w:r>
+        <w:rPr>
+          <w:b w:val="0"/>
+          <w:i w:val="0"/>
+          <w:sz w:val="22"/>
+        </w:rPr>
+        <w:t>Head of Marketing / VP Marketing / CMO, Head of Partnerships / Partner Marketing, Field-/Event-Marketing-Manager, Head of Brand — bei skalierenden, oft finanzierten B2B-/Tech-Unternehmen. Reihenfolge: zuerst Partnerships &amp; Field-/Event-Marketing (konkretester Anlass), dann Marketing-/Brand-Leads.</w:t>
+      </w:r>
+    </w:p>
+    <w:p>
+      <w:r>
+        <w:rPr>
+          <w:b/>
+          <w:color w:val="0A0A0F"/>
+        </w:rPr>
+        <w:t>Freigegebene First-Touch-Varianten (Referenz für die AI):</w:t>
+      </w:r>
+    </w:p>
+    <w:p>
+      <w:pPr>
+        <w:spacing w:before="160"/>
+      </w:pPr>
+      <w:r>
+        <w:rPr>
+          <w:b/>
+          <w:color w:val="2A6FFD"/>
+          <w:sz w:val="23"/>
+        </w:rPr>
+        <w:t>Version 1 — strategisch &amp; seriös</w:t>
+      </w:r>
+    </w:p>
+    <w:p>
+      <w:pPr>
+        <w:ind w:left="280"/>
+      </w:pPr>
+      <w:r>
+        <w:rPr>
+          <w:sz w:val="21"/>
+        </w:rPr>
+        <w:t>Sehr geehrter Herr Shaw,</w:t>
+        <w:br/>
+        <w:br/>
+        <w:t>die Series-D-Finanzierung über 350 Mio. US-Dollar und der Ausbau des Partner-Ökosystems zeigen, dass Parloa in eine starke Skalierungsphase geht.</w:t>
+        <w:br/>
+        <w:br/>
+        <w:t>Wir unterstützen B2B-Unternehmen als Marketing-Partner mit modularen Brand Activations, LED-Messesystemen, interaktiven Eventmodulen und hochwertiger Medienproduktion.</w:t>
+        <w:br/>
+        <w:br/>
+        <w:t>Unsere 360° Video Booth ist dabei ein Beispiel: Sie verbindet Marke, Produkt und Zielgruppe an physischen Touchpoints mit direkt nutzbarem Social Content, hoher Interaktion und optionaler Lead-Erfassung.</w:t>
+        <w:br/>
+        <w:br/>
+        <w:t>Gerne zeige ich Ihnen in einem kurzen digitalen Austausch, wie ein solches Aktivierungsmodul für Parloa aussehen könnte.</w:t>
+        <w:br/>
+        <w:br/>
+        <w:t>Beste Grüße</w:t>
+        <w:br/>
+        <w:t>Youssef Ismail</w:t>
+      </w:r>
+    </w:p>
+    <w:p>
+      <w:pPr>
+        <w:spacing w:before="160"/>
+      </w:pPr>
+      <w:r>
+        <w:rPr>
+          <w:b/>
+          <w:color w:val="2A6FFD"/>
+          <w:sz w:val="23"/>
+        </w:rPr>
+        <w:t>Version 2 — etwas selbstbewusster</w:t>
+      </w:r>
+    </w:p>
+    <w:p>
+      <w:pPr>
+        <w:ind w:left="280"/>
+      </w:pPr>
+      <w:r>
+        <w:rPr>
+          <w:sz w:val="21"/>
+        </w:rPr>
+        <w:t>Sehr geehrter Herr Shaw,</w:t>
+        <w:br/>
+        <w:br/>
+        <w:t>Parloa skaliert sichtbar international — mit starker Finanzierung, wachsendem Partner-Ökosystem und zunehmender Präsenz an Enterprise-Touchpoints.</w:t>
+        <w:br/>
+        <w:br/>
+        <w:t>Genau dort setzen wir an: als B2B-Marketing-Partner für modulare Brand Activations, LED-Messesysteme, interaktive Eventformate und Content-Produktion.</w:t>
+        <w:br/>
+        <w:br/>
+        <w:t>Die 360° Video Booth ist eines unserer Module, um Marke oder Produkt vor Ort erlebbar zu machen und daraus direkt Social Content, Reichweite und qualifizierte Interaktion zu erzeugen.</w:t>
+        <w:br/>
+        <w:br/>
+        <w:t>Falls physische Aktivierungen für Partner-Events, Messen oder Roadshows relevant sind, würde ich Ihnen gerne einen kompakten Ansatz zeigen.</w:t>
+        <w:br/>
+        <w:br/>
+        <w:t>Beste Grüße</w:t>
+        <w:br/>
+        <w:t>Youssef Ismail</w:t>
+      </w:r>
+    </w:p>
+    <w:p>
+      <w:pPr>
+        <w:spacing w:before="160"/>
+      </w:pPr>
+      <w:r>
+        <w:rPr>
+          <w:b/>
+          <w:color w:val="2A6FFD"/>
+          <w:sz w:val="23"/>
+        </w:rPr>
+        <w:t>Version 3 — Premium &amp; klar</w:t>
+      </w:r>
+    </w:p>
+    <w:p>
+      <w:pPr>
+        <w:ind w:left="280"/>
+      </w:pPr>
+      <w:r>
+        <w:rPr>
+          <w:sz w:val="21"/>
+        </w:rPr>
+        <w:t>Sehr geehrter Herr Shaw,</w:t>
+        <w:br/>
+        <w:br/>
+        <w:t>mit der aktuellen Skalierungsphase von Parloa wird die Qualität physischer Touchpoints noch relevanter — besonders bei Messen, Partnerformaten und Roadshows.</w:t>
+        <w:br/>
+        <w:br/>
+        <w:t>Wir entwickeln modulare B2B Brand Activations mit LED-Messesystemen, interaktiven Eventmodulen und hochwertiger Medienproduktion.</w:t>
+        <w:br/>
+        <w:br/>
+        <w:t>Unsere 360° Video Booth ist ein Beispiel dafür: ein kompaktes Aktivierungsmodul, das Markenpräsenz, Social Content und Reichweite direkt vor Ort miteinander verbindet.</w:t>
+        <w:br/>
+        <w:br/>
+        <w:t>Gerne zeige ich Ihnen in 30 Minuten, wie ein solches Modul für Parloa eingesetzt werden könnte.</w:t>
+        <w:br/>
+        <w:br/>
+        <w:t>Beste Grüße</w:t>
+        <w:br/>
+        <w:t>Youssef Ismail</w:t>
+      </w:r>
+    </w:p>
+    <w:p>
+      <w:pPr>
+        <w:spacing w:before="160"/>
+      </w:pPr>
+      <w:r>
+        <w:rPr>
+          <w:b/>
+          <w:color w:val="2A6FFD"/>
+          <w:sz w:val="23"/>
+        </w:rPr>
+        <w:t>Version 4 — sehr kurz &amp; direkt</w:t>
+      </w:r>
+    </w:p>
+    <w:p>
+      <w:pPr>
+        <w:ind w:left="280"/>
+      </w:pPr>
+      <w:r>
+        <w:rPr>
+          <w:sz w:val="21"/>
+        </w:rPr>
+        <w:t>Sehr geehrter Herr Shaw,</w:t>
+        <w:br/>
+        <w:br/>
+        <w:t>Parloa befindet sich sichtbar in einer starken Skalierungsphase — international, partnergetrieben und mit hoher Relevanz für Messen, Roadshows und Enterprise-Events.</w:t>
+        <w:br/>
+        <w:br/>
+        <w:t>Wir unterstützen B2B-Unternehmen mit modularen Brand Activations, LED-Messesystemen, interaktiven Eventmodulen und Medienproduktion.</w:t>
+        <w:br/>
+        <w:br/>
+        <w:t>Die 360° Video Booth ist dabei eines unserer Tools, um Marke, Produkt und Zielgruppe vor Ort mit Reichweite, Social Content und Interaktion zu verbinden.</w:t>
+        <w:br/>
+        <w:br/>
+        <w:t>Gerne würde ich Ihnen kurz zeigen, wie ein solches Format für Parloa aussehen könnte.</w:t>
+        <w:br/>
+        <w:br/>
+        <w:t>Beste Grüße</w:t>
+        <w:br/>
+        <w:t>Youssef Ismail</w:t>
       </w:r>
     </w:p>
     <w:sectPr>

</xml_diff>